<commit_message>
Fix template docx (#83)
fix templates docx
</commit_message>
<xml_diff>
--- a/api/docs/examples/generation-render/test_template.docx
+++ b/api/docs/examples/generation-render/test_template.docx
@@ -8,13 +8,21 @@
         <w:t>Bonjour {{ nom }}, vous habitez a {{ ville }}.</w:t>
       </w:r>
     </w:p>
-    <w:p xmlns:wp14="http://schemas.microsoft.com/office/word/2010/wordml" wp14:paraId="0BB303B4" wp14:textId="09A19234">
+    <w:p xmlns:wp14="http://schemas.microsoft.com/office/word/2010/wordml" wp14:paraId="0BB303B4" wp14:textId="64C51141">
       <w:pPr>
         <w:pStyle w:val="Normal"/>
       </w:pPr>
       <w:r>
         <w:rPr/>
-        <w:t>{% if is_admin != '' %}</w:t>
+        <w:t>{% if is_admin</w:t>
+      </w:r>
+      <w:r>
+        <w:rPr/>
+        <w:t xml:space="preserve"> </w:t>
+      </w:r>
+      <w:r>
+        <w:rPr/>
+        <w:t>%}</w:t>
       </w:r>
     </w:p>
     <w:p xmlns:wp14="http://schemas.microsoft.com/office/word/2010/wordml" wp14:paraId="6C7F9C4E" wp14:textId="2A31DD89">

</xml_diff>